<commit_message>
test(engine): extraccion de punta a punta sobre el expediente de ejemplo
</commit_message>
<xml_diff>
--- a/engine/tests/fixtures/Anexo_1_condiciones.docx
+++ b/engine/tests/fixtures/Anexo_1_condiciones.docx
@@ -67,6 +67,11 @@
         </w:tc>
       </w:tr>
     </w:tbl>
+    <w:p>
+      <w:r>
+        <w:t>Representante legal: María F. Rojas Peña</w:t>
+      </w:r>
+    </w:p>
     <w:sectPr>
       <w:pgSz w:w="12240" w:h="15840"/>
       <w:pgMar w:top="1440" w:right="1800" w:bottom="1440" w:left="1800" w:header="720" w:footer="720" w:gutter="0"/>

</xml_diff>